<commit_message>
CAM timer rephase on ID change; CAM timing caveat on test summaries
- vnap-patches: the CAM timer restarts at a random phase on every full ID
  change (cam_application.{hpp,cpp}, main.cpp); image vnap:r2-p17. Before,
  each car's CAM timing carried over to its new identity and a timing-only
  linker matched 16 of 16 changes; afterwards 1 of 13.
- README: CAM timing under Pseudonym change events; patch table row.
- TestSummaries: the three summaries and the index note that their results
  (images up to vnap:r2-p16) hold only against an eavesdropper that ignores
  CAM timing.

Co-Authored-By: Claude Opus 5.5 <noreply@anthropic.com>
</commit_message>
<xml_diff>
--- a/TestSummaries/convoy-test-2026-10-04.docx
+++ b/TestSummaries/convoy-test-2026-10-04.docx
@@ -213,6 +213,17 @@
       </w:tr>
     </w:tbl>
     <w:p/>
+    <w:p>
+      <w:r>
+        <w:rPr>
+          <w:b/>
+        </w:rPr>
+        <w:t xml:space="preserve">Note added 2026-10-04 (CAM timing leak): </w:t>
+      </w:r>
+      <w:r>
+        <w:t>These results hold only against an eavesdropper that ignores CAM timing. In the image used for this run (vnap:r2-p16) the CAM timer kept running through each ID change, so every car's position within the 1 s CAM cycle carried over to its new identity. Matching on that timing alone linked 16 of 16 changes in the random-turn mix zone. vnap:r2-p17 restarts the CAM timer at a random phase on every ID change (the same matching then linked 1 of 13). Rerun the scenario with vnap:r2-p17 or later before relying on these numbers.</w:t>
+      </w:r>
+    </w:p>
     <w:p>
       <w:pPr>
         <w:pStyle w:val="Heading1"/>

</xml_diff>